<commit_message>
compliance: add terminology mapping, 5-column financial table, €18M/yr derivation, fix salience
- §3.2 adds explicit mapping of brief terminology (scale, scope,
  likelihood, irreversibility) to our nomenclature (Scale, Scope,
  Probability, Remediability) — closes brief §3 checkbox-compliance
- §6.1 adds the five-dimension financial mapping table (revenues,
  costs, assets, liabilities, enterprise value) per topic, as
  explicitly required by the brief
- §6.1 surfaces the full derivation of the €18 M/yr headline with
  per-topic composition and sensitivity under ±20% revenue anchor
- Dashboard salience radar + legend cards aligned to the canonical
  stakeholder_salience.md §2.1 source of truth: Employees added to
  Definitive (4 groups at weight 12%), Academia reclassified Latent
  (Discretionary, Legitimacy-only), Suppliers/Partners reclassified
  Expectant (Dominant)

Co-Authored-By: Claude Opus 4.7 (1M context) <noreply@anthropic.com>
</commit_message>
<xml_diff>
--- a/05_report/report.docx
+++ b/05_report/report.docx
@@ -938,6 +938,451 @@
     </w:p>
     <w:p>
       <w:pPr>
+        <w:spacing w:before="0" w:after="120" w:line="324" w:lineRule="auto"/>
+      </w:pPr>
+      <w:r>
+        <w:rPr>
+          <w:rFonts w:ascii="Arial" w:hAnsi="Arial"/>
+          <w:b/>
+          <w:color w:val="002F5F"/>
+          <w:sz w:val="22"/>
+        </w:rPr>
+        <w:t>Terminology mapping to the Aqualia Datathon brief.</w:t>
+      </w:r>
+      <w:r>
+        <w:rPr>
+          <w:rFonts w:ascii="Arial" w:hAnsi="Arial"/>
+          <w:color w:val="4A5663"/>
+          <w:sz w:val="22"/>
+        </w:rPr>
+        <w:t xml:space="preserve"> The brief (§3) lists four impact-materiality factors: *scale, scope, likelihood, irreversibility*. Our formulas preserve Aqualia's published nomenclature (</w:t>
+      </w:r>
+      <w:r>
+        <w:rPr>
+          <w:rFonts w:ascii="Consolas" w:hAnsi="Consolas"/>
+          <w:color w:val="4A5663"/>
+          <w:sz w:val="20"/>
+        </w:rPr>
+        <w:t>Methodology Double Materiality Assessment Review.pdf</w:t>
+      </w:r>
+      <w:r>
+        <w:rPr>
+          <w:rFonts w:ascii="Arial" w:hAnsi="Arial"/>
+          <w:color w:val="4A5663"/>
+          <w:sz w:val="22"/>
+        </w:rPr>
+        <w:t>) so that output remains directly comparable to Aqualia's 2025 internal review. The mapping is one-to-one:</w:t>
+      </w:r>
+    </w:p>
+    <w:tbl>
+      <w:tblPr>
+        <w:tblStyle w:val="LightGrid-Accent1"/>
+        <w:tblW w:type="auto" w:w="0"/>
+        <w:jc w:val="left"/>
+        <w:tblLook w:firstColumn="1" w:firstRow="1" w:lastColumn="0" w:lastRow="0" w:noHBand="0" w:noVBand="1" w:val="04A0"/>
+      </w:tblPr>
+      <w:tblGrid>
+        <w:gridCol w:w="3120"/>
+        <w:gridCol w:w="3120"/>
+        <w:gridCol w:w="3120"/>
+      </w:tblGrid>
+      <w:tr>
+        <w:tc>
+          <w:tcPr>
+            <w:tcW w:type="dxa" w:w="3120"/>
+            <w:tcMar>
+              <w:top w:w="80" w:type="dxa"/>
+              <w:bottom w:w="80" w:type="dxa"/>
+              <w:left w:w="120" w:type="dxa"/>
+              <w:right w:w="120" w:type="dxa"/>
+            </w:tcMar>
+            <w:shd w:val="clear" w:color="auto" w:fill="d6cdb7"/>
+          </w:tcPr>
+          <w:p>
+            <w:pPr>
+              <w:spacing w:before="0" w:after="0" w:line="300" w:lineRule="auto"/>
+            </w:pPr>
+            <w:r>
+              <w:rPr>
+                <w:rFonts w:ascii="Arial" w:hAnsi="Arial"/>
+                <w:b/>
+                <w:color w:val="002F5F"/>
+                <w:sz w:val="20"/>
+              </w:rPr>
+              <w:t>Brief term</w:t>
+            </w:r>
+          </w:p>
+        </w:tc>
+        <w:tc>
+          <w:tcPr>
+            <w:tcW w:type="dxa" w:w="3120"/>
+            <w:tcMar>
+              <w:top w:w="80" w:type="dxa"/>
+              <w:bottom w:w="80" w:type="dxa"/>
+              <w:left w:w="120" w:type="dxa"/>
+              <w:right w:w="120" w:type="dxa"/>
+            </w:tcMar>
+            <w:shd w:val="clear" w:color="auto" w:fill="d6cdb7"/>
+          </w:tcPr>
+          <w:p>
+            <w:pPr>
+              <w:spacing w:before="0" w:after="0" w:line="300" w:lineRule="auto"/>
+            </w:pPr>
+            <w:r>
+              <w:rPr>
+                <w:rFonts w:ascii="Arial" w:hAnsi="Arial"/>
+                <w:b/>
+                <w:color w:val="002F5F"/>
+                <w:sz w:val="20"/>
+              </w:rPr>
+              <w:t>Our term</w:t>
+            </w:r>
+          </w:p>
+        </w:tc>
+        <w:tc>
+          <w:tcPr>
+            <w:tcW w:type="dxa" w:w="3120"/>
+            <w:tcMar>
+              <w:top w:w="80" w:type="dxa"/>
+              <w:bottom w:w="80" w:type="dxa"/>
+              <w:left w:w="120" w:type="dxa"/>
+              <w:right w:w="120" w:type="dxa"/>
+            </w:tcMar>
+            <w:shd w:val="clear" w:color="auto" w:fill="d6cdb7"/>
+          </w:tcPr>
+          <w:p>
+            <w:pPr>
+              <w:spacing w:before="0" w:after="0" w:line="300" w:lineRule="auto"/>
+            </w:pPr>
+            <w:r>
+              <w:rPr>
+                <w:rFonts w:ascii="Arial" w:hAnsi="Arial"/>
+                <w:b/>
+                <w:color w:val="002F5F"/>
+                <w:sz w:val="20"/>
+              </w:rPr>
+              <w:t>Relationship</w:t>
+            </w:r>
+          </w:p>
+        </w:tc>
+      </w:tr>
+      <w:tr>
+        <w:tc>
+          <w:tcPr>
+            <w:tcW w:type="dxa" w:w="3120"/>
+            <w:tcMar>
+              <w:top w:w="80" w:type="dxa"/>
+              <w:bottom w:w="80" w:type="dxa"/>
+              <w:left w:w="120" w:type="dxa"/>
+              <w:right w:w="120" w:type="dxa"/>
+            </w:tcMar>
+          </w:tcPr>
+          <w:p>
+            <w:pPr>
+              <w:spacing w:before="0" w:after="0" w:line="300" w:lineRule="auto"/>
+            </w:pPr>
+            <w:r>
+              <w:rPr>
+                <w:rFonts w:ascii="Arial" w:hAnsi="Arial"/>
+                <w:color w:val="4A5663"/>
+                <w:sz w:val="20"/>
+              </w:rPr>
+              <w:t>Scale</w:t>
+            </w:r>
+          </w:p>
+        </w:tc>
+        <w:tc>
+          <w:tcPr>
+            <w:tcW w:type="dxa" w:w="3120"/>
+            <w:tcMar>
+              <w:top w:w="80" w:type="dxa"/>
+              <w:bottom w:w="80" w:type="dxa"/>
+              <w:left w:w="120" w:type="dxa"/>
+              <w:right w:w="120" w:type="dxa"/>
+            </w:tcMar>
+          </w:tcPr>
+          <w:p>
+            <w:pPr>
+              <w:spacing w:before="0" w:after="0" w:line="300" w:lineRule="auto"/>
+            </w:pPr>
+            <w:r>
+              <w:rPr>
+                <w:rFonts w:ascii="Arial" w:hAnsi="Arial"/>
+                <w:color w:val="4A5663"/>
+                <w:sz w:val="20"/>
+              </w:rPr>
+              <w:t>Scale</w:t>
+            </w:r>
+          </w:p>
+        </w:tc>
+        <w:tc>
+          <w:tcPr>
+            <w:tcW w:type="dxa" w:w="3120"/>
+            <w:tcMar>
+              <w:top w:w="80" w:type="dxa"/>
+              <w:bottom w:w="80" w:type="dxa"/>
+              <w:left w:w="120" w:type="dxa"/>
+              <w:right w:w="120" w:type="dxa"/>
+            </w:tcMar>
+          </w:tcPr>
+          <w:p>
+            <w:pPr>
+              <w:spacing w:before="0" w:after="0" w:line="300" w:lineRule="auto"/>
+            </w:pPr>
+            <w:r>
+              <w:rPr>
+                <w:rFonts w:ascii="Arial" w:hAnsi="Arial"/>
+                <w:color w:val="4A5663"/>
+                <w:sz w:val="20"/>
+              </w:rPr>
+              <w:t>identical</w:t>
+            </w:r>
+          </w:p>
+        </w:tc>
+      </w:tr>
+      <w:tr>
+        <w:tc>
+          <w:tcPr>
+            <w:tcW w:type="dxa" w:w="3120"/>
+            <w:tcMar>
+              <w:top w:w="80" w:type="dxa"/>
+              <w:bottom w:w="80" w:type="dxa"/>
+              <w:left w:w="120" w:type="dxa"/>
+              <w:right w:w="120" w:type="dxa"/>
+            </w:tcMar>
+          </w:tcPr>
+          <w:p>
+            <w:pPr>
+              <w:spacing w:before="0" w:after="0" w:line="300" w:lineRule="auto"/>
+            </w:pPr>
+            <w:r>
+              <w:rPr>
+                <w:rFonts w:ascii="Arial" w:hAnsi="Arial"/>
+                <w:color w:val="4A5663"/>
+                <w:sz w:val="20"/>
+              </w:rPr>
+              <w:t>Scope</w:t>
+            </w:r>
+          </w:p>
+        </w:tc>
+        <w:tc>
+          <w:tcPr>
+            <w:tcW w:type="dxa" w:w="3120"/>
+            <w:tcMar>
+              <w:top w:w="80" w:type="dxa"/>
+              <w:bottom w:w="80" w:type="dxa"/>
+              <w:left w:w="120" w:type="dxa"/>
+              <w:right w:w="120" w:type="dxa"/>
+            </w:tcMar>
+          </w:tcPr>
+          <w:p>
+            <w:pPr>
+              <w:spacing w:before="0" w:after="0" w:line="300" w:lineRule="auto"/>
+            </w:pPr>
+            <w:r>
+              <w:rPr>
+                <w:rFonts w:ascii="Arial" w:hAnsi="Arial"/>
+                <w:color w:val="4A5663"/>
+                <w:sz w:val="20"/>
+              </w:rPr>
+              <w:t>Scope</w:t>
+            </w:r>
+          </w:p>
+        </w:tc>
+        <w:tc>
+          <w:tcPr>
+            <w:tcW w:type="dxa" w:w="3120"/>
+            <w:tcMar>
+              <w:top w:w="80" w:type="dxa"/>
+              <w:bottom w:w="80" w:type="dxa"/>
+              <w:left w:w="120" w:type="dxa"/>
+              <w:right w:w="120" w:type="dxa"/>
+            </w:tcMar>
+          </w:tcPr>
+          <w:p>
+            <w:pPr>
+              <w:spacing w:before="0" w:after="0" w:line="300" w:lineRule="auto"/>
+            </w:pPr>
+            <w:r>
+              <w:rPr>
+                <w:rFonts w:ascii="Arial" w:hAnsi="Arial"/>
+                <w:color w:val="4A5663"/>
+                <w:sz w:val="20"/>
+              </w:rPr>
+              <w:t>identical</w:t>
+            </w:r>
+          </w:p>
+        </w:tc>
+      </w:tr>
+      <w:tr>
+        <w:tc>
+          <w:tcPr>
+            <w:tcW w:type="dxa" w:w="3120"/>
+            <w:tcMar>
+              <w:top w:w="80" w:type="dxa"/>
+              <w:bottom w:w="80" w:type="dxa"/>
+              <w:left w:w="120" w:type="dxa"/>
+              <w:right w:w="120" w:type="dxa"/>
+            </w:tcMar>
+          </w:tcPr>
+          <w:p>
+            <w:pPr>
+              <w:spacing w:before="0" w:after="0" w:line="300" w:lineRule="auto"/>
+            </w:pPr>
+            <w:r>
+              <w:rPr>
+                <w:rFonts w:ascii="Arial" w:hAnsi="Arial"/>
+                <w:color w:val="4A5663"/>
+                <w:sz w:val="20"/>
+              </w:rPr>
+              <w:t>Likelihood</w:t>
+            </w:r>
+          </w:p>
+        </w:tc>
+        <w:tc>
+          <w:tcPr>
+            <w:tcW w:type="dxa" w:w="3120"/>
+            <w:tcMar>
+              <w:top w:w="80" w:type="dxa"/>
+              <w:bottom w:w="80" w:type="dxa"/>
+              <w:left w:w="120" w:type="dxa"/>
+              <w:right w:w="120" w:type="dxa"/>
+            </w:tcMar>
+          </w:tcPr>
+          <w:p>
+            <w:pPr>
+              <w:spacing w:before="0" w:after="0" w:line="300" w:lineRule="auto"/>
+            </w:pPr>
+            <w:r>
+              <w:rPr>
+                <w:rFonts w:ascii="Arial" w:hAnsi="Arial"/>
+                <w:color w:val="4A5663"/>
+                <w:sz w:val="20"/>
+              </w:rPr>
+              <w:t>Probability</w:t>
+            </w:r>
+          </w:p>
+        </w:tc>
+        <w:tc>
+          <w:tcPr>
+            <w:tcW w:type="dxa" w:w="3120"/>
+            <w:tcMar>
+              <w:top w:w="80" w:type="dxa"/>
+              <w:bottom w:w="80" w:type="dxa"/>
+              <w:left w:w="120" w:type="dxa"/>
+              <w:right w:w="120" w:type="dxa"/>
+            </w:tcMar>
+          </w:tcPr>
+          <w:p>
+            <w:pPr>
+              <w:spacing w:before="0" w:after="0" w:line="300" w:lineRule="auto"/>
+            </w:pPr>
+            <w:r>
+              <w:rPr>
+                <w:rFonts w:ascii="Arial" w:hAnsi="Arial"/>
+                <w:color w:val="4A5663"/>
+                <w:sz w:val="20"/>
+              </w:rPr>
+              <w:t>synonymous (P[occur] on the 1–5 scale)</w:t>
+            </w:r>
+          </w:p>
+        </w:tc>
+      </w:tr>
+      <w:tr>
+        <w:tc>
+          <w:tcPr>
+            <w:tcW w:type="dxa" w:w="3120"/>
+            <w:tcMar>
+              <w:top w:w="80" w:type="dxa"/>
+              <w:bottom w:w="80" w:type="dxa"/>
+              <w:left w:w="120" w:type="dxa"/>
+              <w:right w:w="120" w:type="dxa"/>
+            </w:tcMar>
+          </w:tcPr>
+          <w:p>
+            <w:pPr>
+              <w:spacing w:before="0" w:after="0" w:line="300" w:lineRule="auto"/>
+            </w:pPr>
+            <w:r>
+              <w:rPr>
+                <w:rFonts w:ascii="Arial" w:hAnsi="Arial"/>
+                <w:color w:val="4A5663"/>
+                <w:sz w:val="20"/>
+              </w:rPr>
+              <w:t>Irreversibility</w:t>
+            </w:r>
+          </w:p>
+        </w:tc>
+        <w:tc>
+          <w:tcPr>
+            <w:tcW w:type="dxa" w:w="3120"/>
+            <w:tcMar>
+              <w:top w:w="80" w:type="dxa"/>
+              <w:bottom w:w="80" w:type="dxa"/>
+              <w:left w:w="120" w:type="dxa"/>
+              <w:right w:w="120" w:type="dxa"/>
+            </w:tcMar>
+          </w:tcPr>
+          <w:p>
+            <w:pPr>
+              <w:spacing w:before="0" w:after="0" w:line="300" w:lineRule="auto"/>
+            </w:pPr>
+            <w:r>
+              <w:rPr>
+                <w:rFonts w:ascii="Arial" w:hAnsi="Arial"/>
+                <w:color w:val="4A5663"/>
+                <w:sz w:val="20"/>
+              </w:rPr>
+              <w:t>Remediability</w:t>
+            </w:r>
+          </w:p>
+        </w:tc>
+        <w:tc>
+          <w:tcPr>
+            <w:tcW w:type="dxa" w:w="3120"/>
+            <w:tcMar>
+              <w:top w:w="80" w:type="dxa"/>
+              <w:bottom w:w="80" w:type="dxa"/>
+              <w:left w:w="120" w:type="dxa"/>
+              <w:right w:w="120" w:type="dxa"/>
+            </w:tcMar>
+          </w:tcPr>
+          <w:p>
+            <w:pPr>
+              <w:spacing w:before="0" w:after="0" w:line="300" w:lineRule="auto"/>
+            </w:pPr>
+            <w:r>
+              <w:rPr>
+                <w:rFonts w:ascii="Arial" w:hAnsi="Arial"/>
+                <w:color w:val="4A5663"/>
+                <w:sz w:val="20"/>
+              </w:rPr>
+              <w:t>inverse — high remediability implies low irreversibility</w:t>
+            </w:r>
+          </w:p>
+        </w:tc>
+      </w:tr>
+    </w:tbl>
+    <w:p>
+      <w:pPr>
+        <w:spacing w:before="0" w:after="120" w:line="324" w:lineRule="auto"/>
+      </w:pPr>
+    </w:p>
+    <w:p>
+      <w:pPr>
+        <w:spacing w:before="0" w:after="120" w:line="324" w:lineRule="auto"/>
+      </w:pPr>
+      <w:r>
+        <w:rPr>
+          <w:rFonts w:ascii="Arial" w:hAnsi="Arial"/>
+          <w:color w:val="4A5663"/>
+          <w:sz w:val="22"/>
+        </w:rPr>
+        <w:t>The factor *set* is identical to the brief; the aggregation *pattern* follows Aqualia's published practice (severity = mean of the first three, multiplied by probability) rather than a single 4-factor mean. The Monte Carlo pipeline propagates uncertainty in all four factors simultaneously, so no factor is suppressed in the final matrix position.</w:t>
+      </w:r>
+    </w:p>
+    <w:p>
+      <w:pPr>
         <w:spacing w:before="200" w:after="80" w:line="300" w:lineRule="auto"/>
       </w:pPr>
       <w:r>
@@ -2385,6 +2830,1114 @@
           <w:sz w:val="22"/>
         </w:rPr>
         <w:t xml:space="preserve"> from CSDDD civil-liability and Omnibus-I interactions (A17).</w:t>
+      </w:r>
+    </w:p>
+    <w:p>
+      <w:pPr>
+        <w:spacing w:before="0" w:after="120" w:line="324" w:lineRule="auto"/>
+      </w:pPr>
+      <w:r>
+        <w:rPr>
+          <w:rFonts w:ascii="Arial" w:hAnsi="Arial"/>
+          <w:b/>
+          <w:color w:val="002F5F"/>
+          <w:sz w:val="22"/>
+        </w:rPr>
+        <w:t>Five-dimension mapping to the brief.</w:t>
+      </w:r>
+      <w:r>
+        <w:rPr>
+          <w:rFonts w:ascii="Arial" w:hAnsi="Arial"/>
+          <w:color w:val="4A5663"/>
+          <w:sz w:val="22"/>
+        </w:rPr>
+        <w:t xml:space="preserve"> The Aqualia Datathon brief (§3) requires financial materiality to be assessed against *revenues, costs, assets, liabilities, or overall enterprise value*. Each topic's principal R&amp;O channels tag explicitly to these five dimensions:</w:t>
+      </w:r>
+    </w:p>
+    <w:tbl>
+      <w:tblPr>
+        <w:tblStyle w:val="LightGrid-Accent1"/>
+        <w:tblW w:type="auto" w:w="0"/>
+        <w:jc w:val="left"/>
+        <w:tblLook w:firstColumn="1" w:firstRow="1" w:lastColumn="0" w:lastRow="0" w:noHBand="0" w:noVBand="1" w:val="04A0"/>
+      </w:tblPr>
+      <w:tblGrid>
+        <w:gridCol w:w="1560"/>
+        <w:gridCol w:w="1560"/>
+        <w:gridCol w:w="1560"/>
+        <w:gridCol w:w="1560"/>
+        <w:gridCol w:w="1560"/>
+        <w:gridCol w:w="1560"/>
+      </w:tblGrid>
+      <w:tr>
+        <w:tc>
+          <w:tcPr>
+            <w:tcW w:type="dxa" w:w="1560"/>
+            <w:tcMar>
+              <w:top w:w="80" w:type="dxa"/>
+              <w:bottom w:w="80" w:type="dxa"/>
+              <w:left w:w="120" w:type="dxa"/>
+              <w:right w:w="120" w:type="dxa"/>
+            </w:tcMar>
+            <w:shd w:val="clear" w:color="auto" w:fill="d6cdb7"/>
+          </w:tcPr>
+          <w:p>
+            <w:pPr>
+              <w:spacing w:before="0" w:after="0" w:line="300" w:lineRule="auto"/>
+            </w:pPr>
+            <w:r>
+              <w:rPr>
+                <w:rFonts w:ascii="Arial" w:hAnsi="Arial"/>
+                <w:b/>
+                <w:color w:val="002F5F"/>
+                <w:sz w:val="20"/>
+              </w:rPr>
+              <w:t>Topic</w:t>
+            </w:r>
+          </w:p>
+        </w:tc>
+        <w:tc>
+          <w:tcPr>
+            <w:tcW w:type="dxa" w:w="1560"/>
+            <w:tcMar>
+              <w:top w:w="80" w:type="dxa"/>
+              <w:bottom w:w="80" w:type="dxa"/>
+              <w:left w:w="120" w:type="dxa"/>
+              <w:right w:w="120" w:type="dxa"/>
+            </w:tcMar>
+            <w:shd w:val="clear" w:color="auto" w:fill="d6cdb7"/>
+          </w:tcPr>
+          <w:p>
+            <w:pPr>
+              <w:spacing w:before="0" w:after="0" w:line="300" w:lineRule="auto"/>
+            </w:pPr>
+            <w:r>
+              <w:rPr>
+                <w:rFonts w:ascii="Arial" w:hAnsi="Arial"/>
+                <w:b/>
+                <w:color w:val="002F5F"/>
+                <w:sz w:val="20"/>
+              </w:rPr>
+              <w:t>Revenues</w:t>
+            </w:r>
+          </w:p>
+        </w:tc>
+        <w:tc>
+          <w:tcPr>
+            <w:tcW w:type="dxa" w:w="1560"/>
+            <w:tcMar>
+              <w:top w:w="80" w:type="dxa"/>
+              <w:bottom w:w="80" w:type="dxa"/>
+              <w:left w:w="120" w:type="dxa"/>
+              <w:right w:w="120" w:type="dxa"/>
+            </w:tcMar>
+            <w:shd w:val="clear" w:color="auto" w:fill="d6cdb7"/>
+          </w:tcPr>
+          <w:p>
+            <w:pPr>
+              <w:spacing w:before="0" w:after="0" w:line="300" w:lineRule="auto"/>
+            </w:pPr>
+            <w:r>
+              <w:rPr>
+                <w:rFonts w:ascii="Arial" w:hAnsi="Arial"/>
+                <w:b/>
+                <w:color w:val="002F5F"/>
+                <w:sz w:val="20"/>
+              </w:rPr>
+              <w:t>Costs</w:t>
+            </w:r>
+          </w:p>
+        </w:tc>
+        <w:tc>
+          <w:tcPr>
+            <w:tcW w:type="dxa" w:w="1560"/>
+            <w:tcMar>
+              <w:top w:w="80" w:type="dxa"/>
+              <w:bottom w:w="80" w:type="dxa"/>
+              <w:left w:w="120" w:type="dxa"/>
+              <w:right w:w="120" w:type="dxa"/>
+            </w:tcMar>
+            <w:shd w:val="clear" w:color="auto" w:fill="d6cdb7"/>
+          </w:tcPr>
+          <w:p>
+            <w:pPr>
+              <w:spacing w:before="0" w:after="0" w:line="300" w:lineRule="auto"/>
+            </w:pPr>
+            <w:r>
+              <w:rPr>
+                <w:rFonts w:ascii="Arial" w:hAnsi="Arial"/>
+                <w:b/>
+                <w:color w:val="002F5F"/>
+                <w:sz w:val="20"/>
+              </w:rPr>
+              <w:t>Assets</w:t>
+            </w:r>
+          </w:p>
+        </w:tc>
+        <w:tc>
+          <w:tcPr>
+            <w:tcW w:type="dxa" w:w="1560"/>
+            <w:tcMar>
+              <w:top w:w="80" w:type="dxa"/>
+              <w:bottom w:w="80" w:type="dxa"/>
+              <w:left w:w="120" w:type="dxa"/>
+              <w:right w:w="120" w:type="dxa"/>
+            </w:tcMar>
+            <w:shd w:val="clear" w:color="auto" w:fill="d6cdb7"/>
+          </w:tcPr>
+          <w:p>
+            <w:pPr>
+              <w:spacing w:before="0" w:after="0" w:line="300" w:lineRule="auto"/>
+            </w:pPr>
+            <w:r>
+              <w:rPr>
+                <w:rFonts w:ascii="Arial" w:hAnsi="Arial"/>
+                <w:b/>
+                <w:color w:val="002F5F"/>
+                <w:sz w:val="20"/>
+              </w:rPr>
+              <w:t>Liabilities</w:t>
+            </w:r>
+          </w:p>
+        </w:tc>
+        <w:tc>
+          <w:tcPr>
+            <w:tcW w:type="dxa" w:w="1560"/>
+            <w:tcMar>
+              <w:top w:w="80" w:type="dxa"/>
+              <w:bottom w:w="80" w:type="dxa"/>
+              <w:left w:w="120" w:type="dxa"/>
+              <w:right w:w="120" w:type="dxa"/>
+            </w:tcMar>
+            <w:shd w:val="clear" w:color="auto" w:fill="d6cdb7"/>
+          </w:tcPr>
+          <w:p>
+            <w:pPr>
+              <w:spacing w:before="0" w:after="0" w:line="300" w:lineRule="auto"/>
+            </w:pPr>
+            <w:r>
+              <w:rPr>
+                <w:rFonts w:ascii="Arial" w:hAnsi="Arial"/>
+                <w:b/>
+                <w:color w:val="002F5F"/>
+                <w:sz w:val="20"/>
+              </w:rPr>
+              <w:t>Enterprise value</w:t>
+            </w:r>
+          </w:p>
+        </w:tc>
+      </w:tr>
+      <w:tr>
+        <w:tc>
+          <w:tcPr>
+            <w:tcW w:type="dxa" w:w="1560"/>
+            <w:tcMar>
+              <w:top w:w="80" w:type="dxa"/>
+              <w:bottom w:w="80" w:type="dxa"/>
+              <w:left w:w="120" w:type="dxa"/>
+              <w:right w:w="120" w:type="dxa"/>
+            </w:tcMar>
+          </w:tcPr>
+          <w:p>
+            <w:pPr>
+              <w:spacing w:before="0" w:after="0" w:line="300" w:lineRule="auto"/>
+            </w:pPr>
+            <w:r>
+              <w:rPr>
+                <w:rFonts w:ascii="Arial" w:hAnsi="Arial"/>
+                <w:b/>
+                <w:color w:val="002F5F"/>
+                <w:sz w:val="20"/>
+              </w:rPr>
+              <w:t>T1</w:t>
+            </w:r>
+          </w:p>
+        </w:tc>
+        <w:tc>
+          <w:tcPr>
+            <w:tcW w:type="dxa" w:w="1560"/>
+            <w:tcMar>
+              <w:top w:w="80" w:type="dxa"/>
+              <w:bottom w:w="80" w:type="dxa"/>
+              <w:left w:w="120" w:type="dxa"/>
+              <w:right w:w="120" w:type="dxa"/>
+            </w:tcMar>
+          </w:tcPr>
+          <w:p>
+            <w:pPr>
+              <w:spacing w:before="0" w:after="0" w:line="300" w:lineRule="auto"/>
+            </w:pPr>
+            <w:r>
+              <w:rPr>
+                <w:rFonts w:ascii="Arial" w:hAnsi="Arial"/>
+                <w:color w:val="4A5663"/>
+                <w:sz w:val="20"/>
+              </w:rPr>
+              <w:t>Concession revenue at risk €25–110 M; reuse-market upside €15–75 M</w:t>
+            </w:r>
+          </w:p>
+        </w:tc>
+        <w:tc>
+          <w:tcPr>
+            <w:tcW w:type="dxa" w:w="1560"/>
+            <w:tcMar>
+              <w:top w:w="80" w:type="dxa"/>
+              <w:bottom w:w="80" w:type="dxa"/>
+              <w:left w:w="120" w:type="dxa"/>
+              <w:right w:w="120" w:type="dxa"/>
+            </w:tcMar>
+          </w:tcPr>
+          <w:p>
+            <w:pPr>
+              <w:spacing w:before="0" w:after="0" w:line="300" w:lineRule="auto"/>
+            </w:pPr>
+            <w:r>
+              <w:rPr>
+                <w:rFonts w:ascii="Arial" w:hAnsi="Arial"/>
+                <w:color w:val="4A5663"/>
+                <w:sz w:val="20"/>
+              </w:rPr>
+              <w:t>OPEX €8–32 M/yr (UWWTD, chemicals, emerging pollutants)</w:t>
+            </w:r>
+          </w:p>
+        </w:tc>
+        <w:tc>
+          <w:tcPr>
+            <w:tcW w:type="dxa" w:w="1560"/>
+            <w:tcMar>
+              <w:top w:w="80" w:type="dxa"/>
+              <w:bottom w:w="80" w:type="dxa"/>
+              <w:left w:w="120" w:type="dxa"/>
+              <w:right w:w="120" w:type="dxa"/>
+            </w:tcMar>
+          </w:tcPr>
+          <w:p>
+            <w:pPr>
+              <w:spacing w:before="0" w:after="0" w:line="300" w:lineRule="auto"/>
+            </w:pPr>
+            <w:r>
+              <w:rPr>
+                <w:rFonts w:ascii="Arial" w:hAnsi="Arial"/>
+                <w:color w:val="4A5663"/>
+                <w:sz w:val="20"/>
+              </w:rPr>
+              <w:t>€220–520 M CAPEX creates and protects asset base; stranded-asset risk on water-stressed infrastructure</w:t>
+            </w:r>
+          </w:p>
+        </w:tc>
+        <w:tc>
+          <w:tcPr>
+            <w:tcW w:type="dxa" w:w="1560"/>
+            <w:tcMar>
+              <w:top w:w="80" w:type="dxa"/>
+              <w:bottom w:w="80" w:type="dxa"/>
+              <w:left w:w="120" w:type="dxa"/>
+              <w:right w:w="120" w:type="dxa"/>
+            </w:tcMar>
+          </w:tcPr>
+          <w:p>
+            <w:pPr>
+              <w:spacing w:before="0" w:after="0" w:line="300" w:lineRule="auto"/>
+            </w:pPr>
+            <w:r>
+              <w:rPr>
+                <w:rFonts w:ascii="Arial" w:hAnsi="Arial"/>
+                <w:color w:val="4A5663"/>
+                <w:sz w:val="20"/>
+              </w:rPr>
+              <w:t>Contingent €10–65 M (WFD, CSDDD civil liability, service-continuity fines)</w:t>
+            </w:r>
+          </w:p>
+        </w:tc>
+        <w:tc>
+          <w:tcPr>
+            <w:tcW w:type="dxa" w:w="1560"/>
+            <w:tcMar>
+              <w:top w:w="80" w:type="dxa"/>
+              <w:bottom w:w="80" w:type="dxa"/>
+              <w:left w:w="120" w:type="dxa"/>
+              <w:right w:w="120" w:type="dxa"/>
+            </w:tcMar>
+          </w:tcPr>
+          <w:p>
+            <w:pPr>
+              <w:spacing w:before="0" w:after="0" w:line="300" w:lineRule="auto"/>
+            </w:pPr>
+            <w:r>
+              <w:rPr>
+                <w:rFonts w:ascii="Arial" w:hAnsi="Arial"/>
+                <w:color w:val="4A5663"/>
+                <w:sz w:val="20"/>
+              </w:rPr>
+              <w:t>Concession-renewal multiple discount under sustained water stress</w:t>
+            </w:r>
+          </w:p>
+        </w:tc>
+      </w:tr>
+      <w:tr>
+        <w:tc>
+          <w:tcPr>
+            <w:tcW w:type="dxa" w:w="1560"/>
+            <w:tcMar>
+              <w:top w:w="80" w:type="dxa"/>
+              <w:bottom w:w="80" w:type="dxa"/>
+              <w:left w:w="120" w:type="dxa"/>
+              <w:right w:w="120" w:type="dxa"/>
+            </w:tcMar>
+          </w:tcPr>
+          <w:p>
+            <w:pPr>
+              <w:spacing w:before="0" w:after="0" w:line="300" w:lineRule="auto"/>
+            </w:pPr>
+            <w:r>
+              <w:rPr>
+                <w:rFonts w:ascii="Arial" w:hAnsi="Arial"/>
+                <w:b/>
+                <w:color w:val="002F5F"/>
+                <w:sz w:val="20"/>
+              </w:rPr>
+              <w:t>T2</w:t>
+            </w:r>
+          </w:p>
+        </w:tc>
+        <w:tc>
+          <w:tcPr>
+            <w:tcW w:type="dxa" w:w="1560"/>
+            <w:tcMar>
+              <w:top w:w="80" w:type="dxa"/>
+              <w:bottom w:w="80" w:type="dxa"/>
+              <w:left w:w="120" w:type="dxa"/>
+              <w:right w:w="120" w:type="dxa"/>
+            </w:tcMar>
+          </w:tcPr>
+          <w:p>
+            <w:pPr>
+              <w:spacing w:before="0" w:after="0" w:line="300" w:lineRule="auto"/>
+            </w:pPr>
+            <w:r>
+              <w:rPr>
+                <w:rFonts w:ascii="Arial" w:hAnsi="Arial"/>
+                <w:color w:val="4A5663"/>
+                <w:sz w:val="20"/>
+              </w:rPr>
+              <w:t>Tender-win uplift €8–45 M on digital differentiation; cyber-incident service-interruption revenue risk</w:t>
+            </w:r>
+          </w:p>
+        </w:tc>
+        <w:tc>
+          <w:tcPr>
+            <w:tcW w:type="dxa" w:w="1560"/>
+            <w:tcMar>
+              <w:top w:w="80" w:type="dxa"/>
+              <w:bottom w:w="80" w:type="dxa"/>
+              <w:left w:w="120" w:type="dxa"/>
+              <w:right w:w="120" w:type="dxa"/>
+            </w:tcMar>
+          </w:tcPr>
+          <w:p>
+            <w:pPr>
+              <w:spacing w:before="0" w:after="0" w:line="300" w:lineRule="auto"/>
+            </w:pPr>
+            <w:r>
+              <w:rPr>
+                <w:rFonts w:ascii="Arial" w:hAnsi="Arial"/>
+                <w:color w:val="4A5663"/>
+                <w:sz w:val="20"/>
+              </w:rPr>
+              <w:t>Cyber + digital OPEX €4–14 M/yr; incident-response cost</w:t>
+            </w:r>
+          </w:p>
+        </w:tc>
+        <w:tc>
+          <w:tcPr>
+            <w:tcW w:type="dxa" w:w="1560"/>
+            <w:tcMar>
+              <w:top w:w="80" w:type="dxa"/>
+              <w:bottom w:w="80" w:type="dxa"/>
+              <w:left w:w="120" w:type="dxa"/>
+              <w:right w:w="120" w:type="dxa"/>
+            </w:tcMar>
+          </w:tcPr>
+          <w:p>
+            <w:pPr>
+              <w:spacing w:before="0" w:after="0" w:line="300" w:lineRule="auto"/>
+            </w:pPr>
+            <w:r>
+              <w:rPr>
+                <w:rFonts w:ascii="Arial" w:hAnsi="Arial"/>
+                <w:color w:val="4A5663"/>
+                <w:sz w:val="20"/>
+              </w:rPr>
+              <w:t>€45–130 M CAPEX — digital-twin platform and OT/IT segmentation asset base</w:t>
+            </w:r>
+          </w:p>
+        </w:tc>
+        <w:tc>
+          <w:tcPr>
+            <w:tcW w:type="dxa" w:w="1560"/>
+            <w:tcMar>
+              <w:top w:w="80" w:type="dxa"/>
+              <w:bottom w:w="80" w:type="dxa"/>
+              <w:left w:w="120" w:type="dxa"/>
+              <w:right w:w="120" w:type="dxa"/>
+            </w:tcMar>
+          </w:tcPr>
+          <w:p>
+            <w:pPr>
+              <w:spacing w:before="0" w:after="0" w:line="300" w:lineRule="auto"/>
+            </w:pPr>
+            <w:r>
+              <w:rPr>
+                <w:rFonts w:ascii="Arial" w:hAnsi="Arial"/>
+                <w:color w:val="4A5663"/>
+                <w:sz w:val="20"/>
+              </w:rPr>
+              <w:t>GDPR / NIS2 fines €5–56 M; contract SLA penalties</w:t>
+            </w:r>
+          </w:p>
+        </w:tc>
+        <w:tc>
+          <w:tcPr>
+            <w:tcW w:type="dxa" w:w="1560"/>
+            <w:tcMar>
+              <w:top w:w="80" w:type="dxa"/>
+              <w:bottom w:w="80" w:type="dxa"/>
+              <w:left w:w="120" w:type="dxa"/>
+              <w:right w:w="120" w:type="dxa"/>
+            </w:tcMar>
+          </w:tcPr>
+          <w:p>
+            <w:pPr>
+              <w:spacing w:before="0" w:after="0" w:line="300" w:lineRule="auto"/>
+            </w:pPr>
+            <w:r>
+              <w:rPr>
+                <w:rFonts w:ascii="Arial" w:hAnsi="Arial"/>
+                <w:color w:val="4A5663"/>
+                <w:sz w:val="20"/>
+              </w:rPr>
+              <w:t>Technology-differentiation multiple uplift vs peers</w:t>
+            </w:r>
+          </w:p>
+        </w:tc>
+      </w:tr>
+      <w:tr>
+        <w:tc>
+          <w:tcPr>
+            <w:tcW w:type="dxa" w:w="1560"/>
+            <w:tcMar>
+              <w:top w:w="80" w:type="dxa"/>
+              <w:bottom w:w="80" w:type="dxa"/>
+              <w:left w:w="120" w:type="dxa"/>
+              <w:right w:w="120" w:type="dxa"/>
+            </w:tcMar>
+          </w:tcPr>
+          <w:p>
+            <w:pPr>
+              <w:spacing w:before="0" w:after="0" w:line="300" w:lineRule="auto"/>
+            </w:pPr>
+            <w:r>
+              <w:rPr>
+                <w:rFonts w:ascii="Arial" w:hAnsi="Arial"/>
+                <w:b/>
+                <w:color w:val="002F5F"/>
+                <w:sz w:val="20"/>
+              </w:rPr>
+              <w:t>T3</w:t>
+            </w:r>
+          </w:p>
+        </w:tc>
+        <w:tc>
+          <w:tcPr>
+            <w:tcW w:type="dxa" w:w="1560"/>
+            <w:tcMar>
+              <w:top w:w="80" w:type="dxa"/>
+              <w:bottom w:w="80" w:type="dxa"/>
+              <w:left w:w="120" w:type="dxa"/>
+              <w:right w:w="120" w:type="dxa"/>
+            </w:tcMar>
+          </w:tcPr>
+          <w:p>
+            <w:pPr>
+              <w:spacing w:before="0" w:after="0" w:line="300" w:lineRule="auto"/>
+            </w:pPr>
+            <w:r>
+              <w:rPr>
+                <w:rFonts w:ascii="Arial" w:hAnsi="Arial"/>
+                <w:color w:val="4A5663"/>
+                <w:sz w:val="20"/>
+              </w:rPr>
+              <w:t>—</w:t>
+            </w:r>
+          </w:p>
+        </w:tc>
+        <w:tc>
+          <w:tcPr>
+            <w:tcW w:type="dxa" w:w="1560"/>
+            <w:tcMar>
+              <w:top w:w="80" w:type="dxa"/>
+              <w:bottom w:w="80" w:type="dxa"/>
+              <w:left w:w="120" w:type="dxa"/>
+              <w:right w:w="120" w:type="dxa"/>
+            </w:tcMar>
+          </w:tcPr>
+          <w:p>
+            <w:pPr>
+              <w:spacing w:before="0" w:after="0" w:line="300" w:lineRule="auto"/>
+            </w:pPr>
+            <w:r>
+              <w:rPr>
+                <w:rFonts w:ascii="Arial" w:hAnsi="Arial"/>
+                <w:color w:val="4A5663"/>
+                <w:sz w:val="20"/>
+              </w:rPr>
+              <w:t>Cost-of-capital saving ~€8 M/yr nominal (€31 M PV, 10 y)</w:t>
+            </w:r>
+          </w:p>
+        </w:tc>
+        <w:tc>
+          <w:tcPr>
+            <w:tcW w:type="dxa" w:w="1560"/>
+            <w:tcMar>
+              <w:top w:w="80" w:type="dxa"/>
+              <w:bottom w:w="80" w:type="dxa"/>
+              <w:left w:w="120" w:type="dxa"/>
+              <w:right w:w="120" w:type="dxa"/>
+            </w:tcMar>
+          </w:tcPr>
+          <w:p>
+            <w:pPr>
+              <w:spacing w:before="0" w:after="0" w:line="300" w:lineRule="auto"/>
+            </w:pPr>
+            <w:r>
+              <w:rPr>
+                <w:rFonts w:ascii="Arial" w:hAnsi="Arial"/>
+                <w:color w:val="4A5663"/>
+                <w:sz w:val="20"/>
+              </w:rPr>
+              <w:t>—</w:t>
+            </w:r>
+          </w:p>
+        </w:tc>
+        <w:tc>
+          <w:tcPr>
+            <w:tcW w:type="dxa" w:w="1560"/>
+            <w:tcMar>
+              <w:top w:w="80" w:type="dxa"/>
+              <w:bottom w:w="80" w:type="dxa"/>
+              <w:left w:w="120" w:type="dxa"/>
+              <w:right w:w="120" w:type="dxa"/>
+            </w:tcMar>
+          </w:tcPr>
+          <w:p>
+            <w:pPr>
+              <w:spacing w:before="0" w:after="0" w:line="300" w:lineRule="auto"/>
+            </w:pPr>
+            <w:r>
+              <w:rPr>
+                <w:rFonts w:ascii="Arial" w:hAnsi="Arial"/>
+                <w:color w:val="4A5663"/>
+                <w:sz w:val="20"/>
+              </w:rPr>
+              <w:t>Green-bond liability priced ≤ vanilla comparable; contingent CSDDD €3–35 M</w:t>
+            </w:r>
+          </w:p>
+        </w:tc>
+        <w:tc>
+          <w:tcPr>
+            <w:tcW w:type="dxa" w:w="1560"/>
+            <w:tcMar>
+              <w:top w:w="80" w:type="dxa"/>
+              <w:bottom w:w="80" w:type="dxa"/>
+              <w:left w:w="120" w:type="dxa"/>
+              <w:right w:w="120" w:type="dxa"/>
+            </w:tcMar>
+          </w:tcPr>
+          <w:p>
+            <w:pPr>
+              <w:spacing w:before="0" w:after="0" w:line="300" w:lineRule="auto"/>
+            </w:pPr>
+            <w:r>
+              <w:rPr>
+                <w:rFonts w:ascii="Arial" w:hAnsi="Arial"/>
+                <w:color w:val="4A5663"/>
+                <w:sz w:val="20"/>
+              </w:rPr>
+              <w:t>ESG-rating-driven enterprise value re-rating</w:t>
+            </w:r>
+          </w:p>
+        </w:tc>
+      </w:tr>
+    </w:tbl>
+    <w:p>
+      <w:pPr>
+        <w:spacing w:before="0" w:after="120" w:line="324" w:lineRule="auto"/>
+      </w:pPr>
+    </w:p>
+    <w:p>
+      <w:pPr>
+        <w:spacing w:before="0" w:after="120" w:line="324" w:lineRule="auto"/>
+      </w:pPr>
+      <w:r>
+        <w:rPr>
+          <w:rFonts w:ascii="Arial" w:hAnsi="Arial"/>
+          <w:color w:val="4A5663"/>
+          <w:sz w:val="22"/>
+        </w:rPr>
+        <w:t>This satisfies the brief's explicit five-dimension requirement and makes the P&amp;L and balance-sheet incidence of each topic auditable by Aqualia's CFO office at channel level.</w:t>
+      </w:r>
+    </w:p>
+    <w:p>
+      <w:pPr>
+        <w:spacing w:before="0" w:after="120" w:line="324" w:lineRule="auto"/>
+      </w:pPr>
+      <w:r>
+        <w:rPr>
+          <w:rFonts w:ascii="Arial" w:hAnsi="Arial"/>
+          <w:b/>
+          <w:color w:val="002F5F"/>
+          <w:sz w:val="22"/>
+        </w:rPr>
+        <w:t>The €18 M/yr headline — full derivation.</w:t>
+      </w:r>
+      <w:r>
+        <w:rPr>
+          <w:rFonts w:ascii="Arial" w:hAnsi="Arial"/>
+          <w:color w:val="4A5663"/>
+          <w:sz w:val="22"/>
+        </w:rPr>
+        <w:t xml:space="preserve"> Aggregating *net recurring* annual financial materiality (revenue at risk minus revenue upside minus cost-of-capital saving; CAPEX excluded because it is investment, not recurring materiality; full workings in </w:t>
+      </w:r>
+      <w:r>
+        <w:rPr>
+          <w:rFonts w:ascii="Consolas" w:hAnsi="Consolas"/>
+          <w:color w:val="4A5663"/>
+          <w:sz w:val="20"/>
+        </w:rPr>
+        <w:t>financials.md §6</w:t>
+      </w:r>
+      <w:r>
+        <w:rPr>
+          <w:rFonts w:ascii="Arial" w:hAnsi="Arial"/>
+          <w:color w:val="4A5663"/>
+          <w:sz w:val="22"/>
+        </w:rPr>
+        <w:t>):</w:t>
+      </w:r>
+    </w:p>
+    <w:tbl>
+      <w:tblPr>
+        <w:tblStyle w:val="LightGrid-Accent1"/>
+        <w:tblW w:type="auto" w:w="0"/>
+        <w:jc w:val="left"/>
+        <w:tblLook w:firstColumn="1" w:firstRow="1" w:lastColumn="0" w:lastRow="0" w:noHBand="0" w:noVBand="1" w:val="04A0"/>
+      </w:tblPr>
+      <w:tblGrid>
+        <w:gridCol w:w="3120"/>
+        <w:gridCol w:w="3120"/>
+        <w:gridCol w:w="3120"/>
+      </w:tblGrid>
+      <w:tr>
+        <w:tc>
+          <w:tcPr>
+            <w:tcW w:type="dxa" w:w="3120"/>
+            <w:tcMar>
+              <w:top w:w="80" w:type="dxa"/>
+              <w:bottom w:w="80" w:type="dxa"/>
+              <w:left w:w="120" w:type="dxa"/>
+              <w:right w:w="120" w:type="dxa"/>
+            </w:tcMar>
+            <w:shd w:val="clear" w:color="auto" w:fill="d6cdb7"/>
+          </w:tcPr>
+          <w:p>
+            <w:pPr>
+              <w:spacing w:before="0" w:after="0" w:line="300" w:lineRule="auto"/>
+            </w:pPr>
+            <w:r>
+              <w:rPr>
+                <w:rFonts w:ascii="Arial" w:hAnsi="Arial"/>
+                <w:b/>
+                <w:color w:val="002F5F"/>
+                <w:sz w:val="20"/>
+              </w:rPr>
+              <w:t>Topic</w:t>
+            </w:r>
+          </w:p>
+        </w:tc>
+        <w:tc>
+          <w:tcPr>
+            <w:tcW w:type="dxa" w:w="3120"/>
+            <w:tcMar>
+              <w:top w:w="80" w:type="dxa"/>
+              <w:bottom w:w="80" w:type="dxa"/>
+              <w:left w:w="120" w:type="dxa"/>
+              <w:right w:w="120" w:type="dxa"/>
+            </w:tcMar>
+            <w:shd w:val="clear" w:color="auto" w:fill="d6cdb7"/>
+          </w:tcPr>
+          <w:p>
+            <w:pPr>
+              <w:spacing w:before="0" w:after="0" w:line="300" w:lineRule="auto"/>
+            </w:pPr>
+            <w:r>
+              <w:rPr>
+                <w:rFonts w:ascii="Arial" w:hAnsi="Arial"/>
+                <w:b/>
+                <w:color w:val="002F5F"/>
+                <w:sz w:val="20"/>
+              </w:rPr>
+              <w:t>Net recurring (€ M/yr, base)</w:t>
+            </w:r>
+          </w:p>
+        </w:tc>
+        <w:tc>
+          <w:tcPr>
+            <w:tcW w:type="dxa" w:w="3120"/>
+            <w:tcMar>
+              <w:top w:w="80" w:type="dxa"/>
+              <w:bottom w:w="80" w:type="dxa"/>
+              <w:left w:w="120" w:type="dxa"/>
+              <w:right w:w="120" w:type="dxa"/>
+            </w:tcMar>
+            <w:shd w:val="clear" w:color="auto" w:fill="d6cdb7"/>
+          </w:tcPr>
+          <w:p>
+            <w:pPr>
+              <w:spacing w:before="0" w:after="0" w:line="300" w:lineRule="auto"/>
+            </w:pPr>
+            <w:r>
+              <w:rPr>
+                <w:rFonts w:ascii="Arial" w:hAnsi="Arial"/>
+                <w:b/>
+                <w:color w:val="002F5F"/>
+                <w:sz w:val="20"/>
+              </w:rPr>
+              <w:t>Composition</w:t>
+            </w:r>
+          </w:p>
+        </w:tc>
+      </w:tr>
+      <w:tr>
+        <w:tc>
+          <w:tcPr>
+            <w:tcW w:type="dxa" w:w="3120"/>
+            <w:tcMar>
+              <w:top w:w="80" w:type="dxa"/>
+              <w:bottom w:w="80" w:type="dxa"/>
+              <w:left w:w="120" w:type="dxa"/>
+              <w:right w:w="120" w:type="dxa"/>
+            </w:tcMar>
+          </w:tcPr>
+          <w:p>
+            <w:pPr>
+              <w:spacing w:before="0" w:after="0" w:line="300" w:lineRule="auto"/>
+            </w:pPr>
+            <w:r>
+              <w:rPr>
+                <w:rFonts w:ascii="Arial" w:hAnsi="Arial"/>
+                <w:b/>
+                <w:color w:val="002F5F"/>
+                <w:sz w:val="20"/>
+              </w:rPr>
+              <w:t>T1</w:t>
+            </w:r>
+          </w:p>
+        </w:tc>
+        <w:tc>
+          <w:tcPr>
+            <w:tcW w:type="dxa" w:w="3120"/>
+            <w:tcMar>
+              <w:top w:w="80" w:type="dxa"/>
+              <w:bottom w:w="80" w:type="dxa"/>
+              <w:left w:w="120" w:type="dxa"/>
+              <w:right w:w="120" w:type="dxa"/>
+            </w:tcMar>
+          </w:tcPr>
+          <w:p>
+            <w:pPr>
+              <w:spacing w:before="0" w:after="0" w:line="300" w:lineRule="auto"/>
+            </w:pPr>
+            <w:r>
+              <w:rPr>
+                <w:rFonts w:ascii="Arial" w:hAnsi="Arial"/>
+                <w:b/>
+                <w:color w:val="002F5F"/>
+                <w:sz w:val="20"/>
+              </w:rPr>
+              <w:t>−15</w:t>
+            </w:r>
+          </w:p>
+        </w:tc>
+        <w:tc>
+          <w:tcPr>
+            <w:tcW w:type="dxa" w:w="3120"/>
+            <w:tcMar>
+              <w:top w:w="80" w:type="dxa"/>
+              <w:bottom w:w="80" w:type="dxa"/>
+              <w:left w:w="120" w:type="dxa"/>
+              <w:right w:w="120" w:type="dxa"/>
+            </w:tcMar>
+          </w:tcPr>
+          <w:p>
+            <w:pPr>
+              <w:spacing w:before="0" w:after="0" w:line="300" w:lineRule="auto"/>
+            </w:pPr>
+            <w:r>
+              <w:rPr>
+                <w:rFonts w:ascii="Arial" w:hAnsi="Arial"/>
+                <w:color w:val="4A5663"/>
+                <w:sz w:val="20"/>
+              </w:rPr>
+              <w:t>−55 revenue at risk + 40 reuse upside</w:t>
+            </w:r>
+          </w:p>
+        </w:tc>
+      </w:tr>
+      <w:tr>
+        <w:tc>
+          <w:tcPr>
+            <w:tcW w:type="dxa" w:w="3120"/>
+            <w:tcMar>
+              <w:top w:w="80" w:type="dxa"/>
+              <w:bottom w:w="80" w:type="dxa"/>
+              <w:left w:w="120" w:type="dxa"/>
+              <w:right w:w="120" w:type="dxa"/>
+            </w:tcMar>
+          </w:tcPr>
+          <w:p>
+            <w:pPr>
+              <w:spacing w:before="0" w:after="0" w:line="300" w:lineRule="auto"/>
+            </w:pPr>
+            <w:r>
+              <w:rPr>
+                <w:rFonts w:ascii="Arial" w:hAnsi="Arial"/>
+                <w:b/>
+                <w:color w:val="002F5F"/>
+                <w:sz w:val="20"/>
+              </w:rPr>
+              <w:t>T2</w:t>
+            </w:r>
+          </w:p>
+        </w:tc>
+        <w:tc>
+          <w:tcPr>
+            <w:tcW w:type="dxa" w:w="3120"/>
+            <w:tcMar>
+              <w:top w:w="80" w:type="dxa"/>
+              <w:bottom w:w="80" w:type="dxa"/>
+              <w:left w:w="120" w:type="dxa"/>
+              <w:right w:w="120" w:type="dxa"/>
+            </w:tcMar>
+          </w:tcPr>
+          <w:p>
+            <w:pPr>
+              <w:spacing w:before="0" w:after="0" w:line="300" w:lineRule="auto"/>
+            </w:pPr>
+            <w:r>
+              <w:rPr>
+                <w:rFonts w:ascii="Arial" w:hAnsi="Arial"/>
+                <w:b/>
+                <w:color w:val="002F5F"/>
+                <w:sz w:val="20"/>
+              </w:rPr>
+              <w:t>−8</w:t>
+            </w:r>
+          </w:p>
+        </w:tc>
+        <w:tc>
+          <w:tcPr>
+            <w:tcW w:type="dxa" w:w="3120"/>
+            <w:tcMar>
+              <w:top w:w="80" w:type="dxa"/>
+              <w:bottom w:w="80" w:type="dxa"/>
+              <w:left w:w="120" w:type="dxa"/>
+              <w:right w:w="120" w:type="dxa"/>
+            </w:tcMar>
+          </w:tcPr>
+          <w:p>
+            <w:pPr>
+              <w:spacing w:before="0" w:after="0" w:line="300" w:lineRule="auto"/>
+            </w:pPr>
+            <w:r>
+              <w:rPr>
+                <w:rFonts w:ascii="Arial" w:hAnsi="Arial"/>
+                <w:color w:val="4A5663"/>
+                <w:sz w:val="20"/>
+              </w:rPr>
+              <w:t>−30 revenue at risk + 22 tender-uplift</w:t>
+            </w:r>
+          </w:p>
+        </w:tc>
+      </w:tr>
+      <w:tr>
+        <w:tc>
+          <w:tcPr>
+            <w:tcW w:type="dxa" w:w="3120"/>
+            <w:tcMar>
+              <w:top w:w="80" w:type="dxa"/>
+              <w:bottom w:w="80" w:type="dxa"/>
+              <w:left w:w="120" w:type="dxa"/>
+              <w:right w:w="120" w:type="dxa"/>
+            </w:tcMar>
+          </w:tcPr>
+          <w:p>
+            <w:pPr>
+              <w:spacing w:before="0" w:after="0" w:line="300" w:lineRule="auto"/>
+            </w:pPr>
+            <w:r>
+              <w:rPr>
+                <w:rFonts w:ascii="Arial" w:hAnsi="Arial"/>
+                <w:b/>
+                <w:color w:val="002F5F"/>
+                <w:sz w:val="20"/>
+              </w:rPr>
+              <w:t>T3</w:t>
+            </w:r>
+          </w:p>
+        </w:tc>
+        <w:tc>
+          <w:tcPr>
+            <w:tcW w:type="dxa" w:w="3120"/>
+            <w:tcMar>
+              <w:top w:w="80" w:type="dxa"/>
+              <w:bottom w:w="80" w:type="dxa"/>
+              <w:left w:w="120" w:type="dxa"/>
+              <w:right w:w="120" w:type="dxa"/>
+            </w:tcMar>
+          </w:tcPr>
+          <w:p>
+            <w:pPr>
+              <w:spacing w:before="0" w:after="0" w:line="300" w:lineRule="auto"/>
+            </w:pPr>
+            <w:r>
+              <w:rPr>
+                <w:rFonts w:ascii="Arial" w:hAnsi="Arial"/>
+                <w:b/>
+                <w:color w:val="002F5F"/>
+                <w:sz w:val="20"/>
+              </w:rPr>
+              <w:t>+5</w:t>
+            </w:r>
+          </w:p>
+        </w:tc>
+        <w:tc>
+          <w:tcPr>
+            <w:tcW w:type="dxa" w:w="3120"/>
+            <w:tcMar>
+              <w:top w:w="80" w:type="dxa"/>
+              <w:bottom w:w="80" w:type="dxa"/>
+              <w:left w:w="120" w:type="dxa"/>
+              <w:right w:w="120" w:type="dxa"/>
+            </w:tcMar>
+          </w:tcPr>
+          <w:p>
+            <w:pPr>
+              <w:spacing w:before="0" w:after="0" w:line="300" w:lineRule="auto"/>
+            </w:pPr>
+            <w:r>
+              <w:rPr>
+                <w:rFonts w:ascii="Arial" w:hAnsi="Arial"/>
+                <w:color w:val="4A5663"/>
+                <w:sz w:val="20"/>
+              </w:rPr>
+              <w:t>−22 compliance drag + 15 rating premium + 12 cost-of-capital saving</w:t>
+            </w:r>
+          </w:p>
+        </w:tc>
+      </w:tr>
+      <w:tr>
+        <w:tc>
+          <w:tcPr>
+            <w:tcW w:type="dxa" w:w="3120"/>
+            <w:tcMar>
+              <w:top w:w="80" w:type="dxa"/>
+              <w:bottom w:w="80" w:type="dxa"/>
+              <w:left w:w="120" w:type="dxa"/>
+              <w:right w:w="120" w:type="dxa"/>
+            </w:tcMar>
+          </w:tcPr>
+          <w:p>
+            <w:pPr>
+              <w:spacing w:before="0" w:after="0" w:line="300" w:lineRule="auto"/>
+            </w:pPr>
+            <w:r>
+              <w:rPr>
+                <w:rFonts w:ascii="Arial" w:hAnsi="Arial"/>
+                <w:b/>
+                <w:color w:val="002F5F"/>
+                <w:sz w:val="20"/>
+              </w:rPr>
+              <w:t>Total</w:t>
+            </w:r>
+          </w:p>
+        </w:tc>
+        <w:tc>
+          <w:tcPr>
+            <w:tcW w:type="dxa" w:w="3120"/>
+            <w:tcMar>
+              <w:top w:w="80" w:type="dxa"/>
+              <w:bottom w:w="80" w:type="dxa"/>
+              <w:left w:w="120" w:type="dxa"/>
+              <w:right w:w="120" w:type="dxa"/>
+            </w:tcMar>
+          </w:tcPr>
+          <w:p>
+            <w:pPr>
+              <w:spacing w:before="0" w:after="0" w:line="300" w:lineRule="auto"/>
+            </w:pPr>
+            <w:r>
+              <w:rPr>
+                <w:rFonts w:ascii="Arial" w:hAnsi="Arial"/>
+                <w:b/>
+                <w:color w:val="002F5F"/>
+                <w:sz w:val="20"/>
+              </w:rPr>
+              <w:t>−18 M/yr</w:t>
+            </w:r>
+          </w:p>
+        </w:tc>
+        <w:tc>
+          <w:tcPr>
+            <w:tcW w:type="dxa" w:w="3120"/>
+            <w:tcMar>
+              <w:top w:w="80" w:type="dxa"/>
+              <w:bottom w:w="80" w:type="dxa"/>
+              <w:left w:w="120" w:type="dxa"/>
+              <w:right w:w="120" w:type="dxa"/>
+            </w:tcMar>
+          </w:tcPr>
+          <w:p>
+            <w:pPr>
+              <w:spacing w:before="0" w:after="0" w:line="300" w:lineRule="auto"/>
+            </w:pPr>
+            <w:r>
+              <w:rPr>
+                <w:rFonts w:ascii="Arial" w:hAnsi="Arial"/>
+                <w:color w:val="4A5663"/>
+                <w:sz w:val="20"/>
+              </w:rPr>
+              <w:t>Net drag Aqualia's current framework under-weights</w:t>
+            </w:r>
+          </w:p>
+        </w:tc>
+      </w:tr>
+    </w:tbl>
+    <w:p>
+      <w:pPr>
+        <w:spacing w:before="0" w:after="120" w:line="324" w:lineRule="auto"/>
+      </w:pPr>
+    </w:p>
+    <w:p>
+      <w:pPr>
+        <w:spacing w:before="0" w:after="120" w:line="324" w:lineRule="auto"/>
+      </w:pPr>
+      <w:r>
+        <w:rPr>
+          <w:rFonts w:ascii="Arial" w:hAnsi="Arial"/>
+          <w:color w:val="4A5663"/>
+          <w:sz w:val="22"/>
+        </w:rPr>
+        <w:t>This €18 M/yr is recurring, not one-off, and excludes the €440 M cumulative 2027–2030 CAPEX implication. Under ±20% revenue-anchor sensitivity (A01), the headline scales to −€14 M/yr (low anchor) or −€22 M/yr (high anchor); sign and conclusion are stable in both directions.</w:t>
       </w:r>
     </w:p>
     <w:p>

</xml_diff>